<commit_message>
Name the Efinity Strip Managers in the non-compete acknowledgement
Co-Authored-By: Claude Fable 5.1 <noreply@anthropic.com>
Claude-Session: https://claude.ai/code/session_017WXGuxbkZxKJPwstVR3guK
</commit_message>
<xml_diff>
--- a/MJM - Secondary Term Sheet v20261029_1735 - Corsair markup.docx
+++ b/MJM - Secondary Term Sheet v20261029_1735 - Corsair markup.docx
@@ -80,7 +80,7 @@
         </w:rPr>
         <w:t xml:space="preserve">Efinity Insurance Group Spółka </w:t>
       </w:r>
-      <w:del w:id="1001" w:author="Corsair review" w:date="2026-10-29T17:47:05Z">
+      <w:del w:id="1001" w:author="Corsair review" w:date="2026-10-29T18:22:52Z">
         <w:r>
           <w:rPr>
             <w:rFonts w:ascii="Arial" w:hAnsi="Arial" w:cs="Arial"/>
@@ -88,7 +88,7 @@
           <w:delText xml:space="preserve">Ackyjna</w:delText>
         </w:r>
       </w:del>
-      <w:ins w:id="1002" w:author="Corsair review" w:date="2026-10-29T17:47:05Z">
+      <w:ins w:id="1002" w:author="Corsair review" w:date="2026-10-29T18:22:52Z">
         <w:r>
           <w:rPr>
             <w:rFonts w:ascii="Arial" w:hAnsi="Arial" w:cs="Arial"/>
@@ -1349,7 +1349,7 @@
                 <w:szCs w:val="22"/>
               </w:rPr>
             </w:pPr>
-            <w:del w:id="1005" w:author="Corsair review" w:date="2026-10-29T17:47:05Z">
+            <w:del w:id="1005" w:author="Corsair review" w:date="2026-10-29T18:22:52Z">
               <w:r>
                 <w:rPr>
                   <w:rFonts w:ascii="Arial" w:hAnsi="Arial" w:cs="Arial"/>
@@ -1359,7 +1359,7 @@
                 <w:delText>“</w:delText>
               </w:r>
             </w:del>
-            <w:del w:id="1006" w:author="Corsair review" w:date="2026-10-29T17:47:05Z">
+            <w:del w:id="1006" w:author="Corsair review" w:date="2026-10-29T18:22:52Z">
               <w:r>
                 <w:rPr>
                   <w:rFonts w:ascii="Arial" w:hAnsi="Arial" w:cs="Arial"/>
@@ -1370,7 +1370,7 @@
                 <w:delText>FY26A Adjusted EBITDA</w:delText>
               </w:r>
             </w:del>
-            <w:del w:id="1007" w:author="Corsair review" w:date="2026-10-29T17:47:05Z">
+            <w:del w:id="1007" w:author="Corsair review" w:date="2026-10-29T18:22:52Z">
               <w:r>
                 <w:rPr>
                   <w:rFonts w:ascii="Arial" w:hAnsi="Arial" w:cs="Arial"/>
@@ -1380,7 +1380,7 @@
                 <w:delText xml:space="preserve">” means the Adjusted EBITDA of the Company for the financial year ending 31 December 2026 as shown in the Company’s FY26 </w:delText>
               </w:r>
             </w:del>
-            <w:del w:id="1008" w:author="Corsair review" w:date="2026-10-29T17:47:05Z">
+            <w:del w:id="1008" w:author="Corsair review" w:date="2026-10-29T18:22:52Z">
               <w:r>
                 <w:rPr>
                   <w:rFonts w:ascii="Arial" w:hAnsi="Arial" w:cs="Arial"/>
@@ -1390,7 +1390,7 @@
                 <w:delText>preliminary financial statements</w:delText>
               </w:r>
             </w:del>
-            <w:ins w:id="1009" w:author="Corsair review" w:date="2026-10-29T17:47:05Z">
+            <w:ins w:id="1009" w:author="Corsair review" w:date="2026-10-29T18:22:52Z">
               <w:r>
                 <w:rPr>
                   <w:rFonts w:ascii="Arial" w:hAnsi="Arial" w:cs="Arial"/>
@@ -1432,13 +1432,13 @@
               <w:ind w:left="357" w:hanging="357"/>
               <w:contextualSpacing/>
               <w:rPr>
-                <w:ins w:id="1010" w:author="Corsair review" w:date="2026-10-29T17:47:05Z"/>
+                <w:ins w:id="1010" w:author="Corsair review" w:date="2026-10-29T18:22:52Z"/>
                 <w:rFonts w:ascii="Arial" w:hAnsi="Arial" w:cs="Arial"/>
                 <w:sz w:val="22"/>
                 <w:szCs w:val="22"/>
               </w:rPr>
             </w:pPr>
-            <w:ins w:id="1011" w:author="Corsair review" w:date="2026-10-29T17:47:05Z">
+            <w:ins w:id="1011" w:author="Corsair review" w:date="2026-10-29T18:22:52Z">
               <w:r>
                 <w:rPr>
                   <w:rFonts w:ascii="Arial" w:hAnsi="Arial" w:cs="Arial"/>
@@ -1480,13 +1480,13 @@
               <w:ind w:left="357" w:hanging="357"/>
               <w:contextualSpacing/>
               <w:rPr>
-                <w:ins w:id="1012" w:author="Corsair review" w:date="2026-10-29T17:47:05Z"/>
+                <w:ins w:id="1012" w:author="Corsair review" w:date="2026-10-29T18:22:52Z"/>
                 <w:rFonts w:ascii="Arial" w:hAnsi="Arial" w:cs="Arial"/>
                 <w:sz w:val="22"/>
                 <w:szCs w:val="22"/>
               </w:rPr>
             </w:pPr>
-            <w:ins w:id="1013" w:author="Corsair review" w:date="2026-10-29T17:47:05Z">
+            <w:ins w:id="1013" w:author="Corsair review" w:date="2026-10-29T18:22:52Z">
               <w:r>
                 <w:rPr>
                   <w:rFonts w:ascii="Arial" w:hAnsi="Arial" w:cs="Arial"/>
@@ -1668,7 +1668,7 @@
                 <w:szCs w:val="22"/>
               </w:rPr>
             </w:pPr>
-            <w:del w:id="1014" w:author="Corsair review" w:date="2026-10-29T17:47:05Z">
+            <w:del w:id="1014" w:author="Corsair review" w:date="2026-10-29T18:22:52Z">
               <w:r>
                 <w:rPr>
                   <w:rFonts w:ascii="Arial" w:hAnsi="Arial" w:cs="Arial"/>
@@ -1678,7 +1678,7 @@
                 <w:delText xml:space="preserve">The FY26A </w:delText>
               </w:r>
             </w:del>
-            <w:del w:id="1015" w:author="Corsair review" w:date="2026-10-29T17:47:05Z">
+            <w:del w:id="1015" w:author="Corsair review" w:date="2026-10-29T18:22:52Z">
               <w:r>
                 <w:rPr>
                   <w:rFonts w:ascii="Arial" w:hAnsi="Arial" w:cs="Arial"/>
@@ -1688,7 +1688,7 @@
                 <w:delText xml:space="preserve">preliminary financial statements </w:delText>
               </w:r>
             </w:del>
-            <w:del w:id="1016" w:author="Corsair review" w:date="2026-10-29T17:47:05Z">
+            <w:del w:id="1016" w:author="Corsair review" w:date="2026-10-29T18:22:52Z">
               <w:r>
                 <w:rPr>
                   <w:rFonts w:ascii="Arial" w:hAnsi="Arial" w:cs="Arial"/>
@@ -1698,7 +1698,7 @@
                 <w:delText>of the Company are expected to be available in late January / early February 2027</w:delText>
               </w:r>
             </w:del>
-            <w:ins w:id="1017" w:author="Corsair review" w:date="2026-10-29T17:47:05Z">
+            <w:ins w:id="1017" w:author="Corsair review" w:date="2026-10-29T18:22:52Z">
               <w:r>
                 <w:rPr>
                   <w:rFonts w:ascii="Arial" w:hAnsi="Arial" w:cs="Arial"/>
@@ -1728,7 +1728,7 @@
                 <w:szCs w:val="22"/>
               </w:rPr>
             </w:pPr>
-            <w:del w:id="1018" w:author="Corsair review" w:date="2026-10-29T17:47:05Z">
+            <w:del w:id="1018" w:author="Corsair review" w:date="2026-10-29T18:22:52Z">
               <w:r>
                 <w:rPr>
                   <w:rFonts w:ascii="Arial" w:hAnsi="Arial" w:cs="Arial"/>
@@ -1738,7 +1738,7 @@
                 <w:delText xml:space="preserve">The </w:delText>
               </w:r>
             </w:del>
-            <w:del w:id="1019" w:author="Corsair review" w:date="2026-10-29T17:47:05Z">
+            <w:del w:id="1019" w:author="Corsair review" w:date="2026-10-29T18:22:52Z">
               <w:r>
                 <w:rPr>
                   <w:rFonts w:ascii="Arial" w:hAnsi="Arial" w:cs="Arial"/>
@@ -1748,7 +1748,7 @@
                 <w:delText xml:space="preserve">Purchase Price is fixed once the FY26A </w:delText>
               </w:r>
             </w:del>
-            <w:del w:id="1020" w:author="Corsair review" w:date="2026-10-29T17:47:05Z">
+            <w:del w:id="1020" w:author="Corsair review" w:date="2026-10-29T18:22:52Z">
               <w:r>
                 <w:rPr>
                   <w:rFonts w:ascii="Arial" w:hAnsi="Arial" w:cs="Arial"/>
@@ -1758,7 +1758,7 @@
                 <w:delText xml:space="preserve">preliminary financial statements </w:delText>
               </w:r>
             </w:del>
-            <w:del w:id="1021" w:author="Corsair review" w:date="2026-10-29T17:47:05Z">
+            <w:del w:id="1021" w:author="Corsair review" w:date="2026-10-29T18:22:52Z">
               <w:r>
                 <w:rPr>
                   <w:rFonts w:ascii="Arial" w:hAnsi="Arial" w:cs="Arial"/>
@@ -1768,7 +1768,7 @@
                 <w:delText>have been delivered, with signing of the share purchase agreement and completion following thereafter</w:delText>
               </w:r>
             </w:del>
-            <w:ins w:id="1022" w:author="Corsair review" w:date="2026-10-29T17:47:05Z">
+            <w:ins w:id="1022" w:author="Corsair review" w:date="2026-10-29T18:22:52Z">
               <w:r>
                 <w:rPr>
                   <w:rFonts w:ascii="Arial" w:hAnsi="Arial" w:cs="Arial"/>
@@ -1827,13 +1827,13 @@
               <w:ind w:left="357" w:hanging="357"/>
               <w:contextualSpacing/>
               <w:rPr>
-                <w:ins w:id="1023" w:author="Corsair review" w:date="2026-10-29T17:47:05Z"/>
+                <w:ins w:id="1023" w:author="Corsair review" w:date="2026-10-29T18:22:52Z"/>
                 <w:rFonts w:ascii="Arial" w:hAnsi="Arial" w:cs="Arial"/>
                 <w:sz w:val="22"/>
                 <w:szCs w:val="22"/>
               </w:rPr>
             </w:pPr>
-            <w:ins w:id="1024" w:author="Corsair review" w:date="2026-10-29T17:47:05Z">
+            <w:ins w:id="1024" w:author="Corsair review" w:date="2026-10-29T18:22:52Z">
               <w:r>
                 <w:rPr>
                   <w:rFonts w:ascii="Arial" w:hAnsi="Arial" w:cs="Arial"/>
@@ -1892,13 +1892,13 @@
               <w:ind w:left="357" w:hanging="357"/>
               <w:contextualSpacing/>
               <w:rPr>
-                <w:ins w:id="1025" w:author="Corsair review" w:date="2026-10-29T17:47:05Z"/>
+                <w:ins w:id="1025" w:author="Corsair review" w:date="2026-10-29T18:22:52Z"/>
                 <w:rFonts w:ascii="Arial" w:hAnsi="Arial" w:cs="Arial"/>
                 <w:sz w:val="22"/>
                 <w:szCs w:val="22"/>
               </w:rPr>
             </w:pPr>
-            <w:ins w:id="1026" w:author="Corsair review" w:date="2026-10-29T17:47:05Z">
+            <w:ins w:id="1026" w:author="Corsair review" w:date="2026-10-29T18:22:52Z">
               <w:r>
                 <w:rPr>
                   <w:rFonts w:ascii="Arial" w:hAnsi="Arial" w:cs="Arial"/>
@@ -1923,13 +1923,13 @@
               <w:ind w:left="357" w:hanging="357"/>
               <w:contextualSpacing/>
               <w:rPr>
-                <w:ins w:id="1027" w:author="Corsair review" w:date="2026-10-29T17:47:05Z"/>
+                <w:ins w:id="1027" w:author="Corsair review" w:date="2026-10-29T18:22:52Z"/>
                 <w:rFonts w:ascii="Arial" w:hAnsi="Arial" w:cs="Arial"/>
                 <w:sz w:val="22"/>
                 <w:szCs w:val="22"/>
               </w:rPr>
             </w:pPr>
-            <w:ins w:id="1028" w:author="Corsair review" w:date="2026-10-29T17:47:05Z">
+            <w:ins w:id="1028" w:author="Corsair review" w:date="2026-10-29T18:22:52Z">
               <w:r>
                 <w:rPr>
                   <w:rFonts w:ascii="Arial" w:hAnsi="Arial" w:cs="Arial"/>
@@ -1954,13 +1954,13 @@
               <w:ind w:left="357" w:hanging="357"/>
               <w:contextualSpacing/>
               <w:rPr>
-                <w:ins w:id="1029" w:author="Corsair review" w:date="2026-10-29T17:47:05Z"/>
+                <w:ins w:id="1029" w:author="Corsair review" w:date="2026-10-29T18:22:52Z"/>
                 <w:rFonts w:ascii="Arial" w:hAnsi="Arial" w:cs="Arial"/>
                 <w:sz w:val="22"/>
                 <w:szCs w:val="22"/>
               </w:rPr>
             </w:pPr>
-            <w:ins w:id="1030" w:author="Corsair review" w:date="2026-10-29T17:47:05Z">
+            <w:ins w:id="1030" w:author="Corsair review" w:date="2026-10-29T18:22:52Z">
               <w:r>
                 <w:rPr>
                   <w:rFonts w:ascii="Arial" w:hAnsi="Arial" w:cs="Arial"/>
@@ -2308,7 +2308,7 @@
               </w:rPr>
               <w:t xml:space="preserve">financial statements and agreement of the </w:t>
             </w:r>
-            <w:del w:id="1031" w:author="Corsair review" w:date="2026-10-29T17:47:05Z">
+            <w:del w:id="1031" w:author="Corsair review" w:date="2026-10-29T18:22:52Z">
               <w:r>
                 <w:rPr>
                   <w:rFonts w:ascii="Arial" w:hAnsi="Arial" w:cs="Arial"/>
@@ -2318,7 +2318,7 @@
                 <w:delText xml:space="preserve">final Purchase Price</w:delText>
               </w:r>
             </w:del>
-            <w:ins w:id="1032" w:author="Corsair review" w:date="2026-10-29T17:47:05Z">
+            <w:ins w:id="1032" w:author="Corsair review" w:date="2026-10-29T18:22:52Z">
               <w:r>
                 <w:rPr>
                   <w:rFonts w:ascii="Arial" w:hAnsi="Arial" w:cs="Arial"/>
@@ -2662,7 +2662,7 @@
               </w:rPr>
               <w:t>short form</w:t>
             </w:r>
-            <w:del w:id="1033" w:author="Corsair review" w:date="2026-10-29T17:47:05Z">
+            <w:del w:id="1033" w:author="Corsair review" w:date="2026-10-29T18:22:52Z">
               <w:r>
                 <w:rPr>
                   <w:rFonts w:ascii="Arial" w:hAnsi="Arial" w:cs="Arial"/>
@@ -2672,7 +2672,7 @@
                 <w:delText xml:space="preserve"> share purchase agreement,</w:delText>
               </w:r>
             </w:del>
-            <w:ins w:id="1034" w:author="Corsair review" w:date="2026-10-29T17:47:05Z">
+            <w:ins w:id="1034" w:author="Corsair review" w:date="2026-10-29T18:22:52Z">
               <w:r>
                 <w:rPr>
                   <w:rFonts w:ascii="Arial" w:hAnsi="Arial" w:cs="Arial"/>
@@ -3086,7 +3086,7 @@
                 <w:szCs w:val="22"/>
               </w:rPr>
             </w:pPr>
-            <w:del w:id="1035" w:author="Corsair review" w:date="2026-10-29T17:47:05Z">
+            <w:del w:id="1035" w:author="Corsair review" w:date="2026-10-29T18:22:52Z">
               <w:r>
                 <w:rPr>
                   <w:rFonts w:ascii="Arial" w:hAnsi="Arial" w:cs="Arial"/>
@@ -3097,7 +3097,7 @@
                 <w:delText>To check in the context of the SHA</w:delText>
               </w:r>
             </w:del>
-            <w:ins w:id="1036" w:author="Corsair review" w:date="2026-10-29T17:47:05Z">
+            <w:ins w:id="1036" w:author="Corsair review" w:date="2026-10-29T18:22:52Z">
               <w:r>
                 <w:rPr>
                   <w:rFonts w:ascii="Arial" w:hAnsi="Arial" w:cs="Arial"/>
@@ -3122,13 +3122,44 @@
               <w:ind w:left="357" w:hanging="357"/>
               <w:contextualSpacing/>
               <w:rPr>
-                <w:ins w:id="1037" w:author="Corsair review" w:date="2026-10-29T17:47:05Z"/>
+                <w:ins w:id="1037" w:author="Corsair review" w:date="2026-10-29T18:22:52Z"/>
                 <w:rFonts w:ascii="Arial" w:hAnsi="Arial" w:cs="Arial"/>
                 <w:sz w:val="22"/>
                 <w:szCs w:val="22"/>
               </w:rPr>
             </w:pPr>
-            <w:ins w:id="1038" w:author="Corsair review" w:date="2026-10-29T17:47:05Z">
+            <w:ins w:id="1038" w:author="Corsair review" w:date="2026-10-29T18:22:52Z">
+              <w:r>
+                <w:rPr>
+                  <w:rFonts w:ascii="Arial" w:hAnsi="Arial" w:cs="Arial"/>
+                  <w:sz w:val="22"/>
+                  <w:szCs w:val="22"/>
+                </w:rPr>
+                <w:t xml:space="preserve">For the avoidance of doubt, each of Maciej Bud-Gusaim, Marcin Chałtowski, Jakub Bednarski and Markos Kologeras is a Strip Manager and Key Manager under the SHA in his own right and remains bound by clause 19 of the SHA in that capacity for the Restricted Period applicable to him, which is not affected by the Proposed Transaction. Efinity will procure that each of them acknowledges the same in the share purchase agreement</w:t>
+              </w:r>
+            </w:ins>
+          </w:p>
+          <w:p>
+            <w:pPr>
+              <w:pStyle w:val="ListBullet"/>
+              <w:numPr>
+                <w:ilvl w:val="0"/>
+                <w:numId w:val="38"/>
+              </w:numPr>
+              <w:tabs>
+                <w:tab w:val="left" w:pos="360"/>
+              </w:tabs>
+              <w:spacing w:before="120" w:after="288" w:line="276" w:lineRule="auto"/>
+              <w:ind w:left="357" w:hanging="357"/>
+              <w:contextualSpacing/>
+              <w:rPr>
+                <w:ins w:id="1039" w:author="Corsair review" w:date="2026-10-29T18:22:52Z"/>
+                <w:rFonts w:ascii="Arial" w:hAnsi="Arial" w:cs="Arial"/>
+                <w:sz w:val="22"/>
+                <w:szCs w:val="22"/>
+              </w:rPr>
+            </w:pPr>
+            <w:ins w:id="1040" w:author="Corsair review" w:date="2026-10-29T18:22:52Z">
               <w:r>
                 <w:rPr>
                   <w:rFonts w:ascii="Arial" w:hAnsi="Arial" w:cs="Arial"/>
@@ -3307,7 +3338,7 @@
               </w:rPr>
               <w:t xml:space="preserve">Agreement of </w:t>
             </w:r>
-            <w:del w:id="1039" w:author="Corsair review" w:date="2026-10-29T17:47:05Z">
+            <w:del w:id="1041" w:author="Corsair review" w:date="2026-10-29T18:22:52Z">
               <w:r>
                 <w:rPr>
                   <w:rFonts w:ascii="Arial" w:hAnsi="Arial" w:cs="Arial"/>
@@ -3317,7 +3348,7 @@
                 <w:delText xml:space="preserve">final Purchase Price</w:delText>
               </w:r>
             </w:del>
-            <w:ins w:id="1040" w:author="Corsair review" w:date="2026-10-29T17:47:05Z">
+            <w:ins w:id="1042" w:author="Corsair review" w:date="2026-10-29T18:22:52Z">
               <w:r>
                 <w:rPr>
                   <w:rFonts w:ascii="Arial" w:hAnsi="Arial" w:cs="Arial"/>
@@ -3405,7 +3436,7 @@
                 <w:szCs w:val="22"/>
               </w:rPr>
             </w:pPr>
-            <w:del w:id="1041" w:author="Corsair review" w:date="2026-10-29T17:47:05Z">
+            <w:del w:id="1043" w:author="Corsair review" w:date="2026-10-29T18:22:52Z">
               <w:r>
                 <w:rPr>
                   <w:rFonts w:ascii="Arial" w:hAnsi="Arial" w:cs="Arial"/>
@@ -3416,7 +3447,7 @@
                 <w:delText>Adjustment period / remediation?</w:delText>
               </w:r>
             </w:del>
-            <w:del w:id="1042" w:author="Corsair review" w:date="2026-10-29T17:47:05Z">
+            <w:del w:id="1044" w:author="Corsair review" w:date="2026-10-29T18:22:52Z">
               <w:r>
                 <w:rPr>
                   <w:rFonts w:ascii="Arial" w:hAnsi="Arial" w:cs="Arial"/>
@@ -3426,7 +3457,7 @@
                 <w:delText xml:space="preserve"> </w:delText>
               </w:r>
             </w:del>
-            <w:ins w:id="1043" w:author="Corsair review" w:date="2026-10-29T17:47:05Z">
+            <w:ins w:id="1045" w:author="Corsair review" w:date="2026-10-29T18:22:52Z">
               <w:r>
                 <w:rPr>
                   <w:rFonts w:ascii="Arial" w:hAnsi="Arial" w:cs="Arial"/>
@@ -3450,13 +3481,13 @@
               <w:spacing w:before="120" w:after="288" w:line="276" w:lineRule="auto"/>
               <w:contextualSpacing/>
               <w:rPr>
-                <w:ins w:id="1044" w:author="Corsair review" w:date="2026-10-29T17:47:05Z"/>
+                <w:ins w:id="1046" w:author="Corsair review" w:date="2026-10-29T18:22:52Z"/>
                 <w:rFonts w:ascii="Arial" w:hAnsi="Arial" w:cs="Arial"/>
                 <w:sz w:val="22"/>
                 <w:szCs w:val="22"/>
               </w:rPr>
             </w:pPr>
-            <w:ins w:id="1045" w:author="Corsair review" w:date="2026-10-29T17:47:05Z">
+            <w:ins w:id="1047" w:author="Corsair review" w:date="2026-10-29T18:22:52Z">
               <w:r>
                 <w:rPr>
                   <w:rFonts w:ascii="Arial" w:hAnsi="Arial" w:cs="Arial"/>
@@ -3917,7 +3948,7 @@
         </w:rPr>
         <w:t xml:space="preserve">EFINITY INSURANCE GROUP SPÓŁKA </w:t>
       </w:r>
-      <w:del w:id="1003" w:author="Corsair review" w:date="2026-10-29T17:47:05Z">
+      <w:del w:id="1003" w:author="Corsair review" w:date="2026-10-29T18:22:52Z">
         <w:r>
           <w:rPr>
             <w:rFonts w:ascii="Arial" w:hAnsi="Arial" w:cs="Arial"/>
@@ -3927,7 +3958,7 @@
           <w:delText xml:space="preserve">ACKYJNA</w:delText>
         </w:r>
       </w:del>
-      <w:ins w:id="1004" w:author="Corsair review" w:date="2026-10-29T17:47:05Z">
+      <w:ins w:id="1004" w:author="Corsair review" w:date="2026-10-29T18:22:52Z">
         <w:r>
           <w:rPr>
             <w:rFonts w:ascii="Arial" w:hAnsi="Arial" w:cs="Arial"/>

</xml_diff>

<commit_message>
Replace 5% collar with full true-up, de minimis and holdback in term sheet markup
Co-Authored-By: Claude Fable 5.1 <noreply@anthropic.com>
Claude-Session: https://claude.ai/code/session_017WXGuxbkZxKJPwstVR3guK
</commit_message>
<xml_diff>
--- a/MJM - Secondary Term Sheet v20261029_1735 - Corsair markup.docx
+++ b/MJM - Secondary Term Sheet v20261029_1735 - Corsair markup.docx
@@ -80,7 +80,7 @@
         </w:rPr>
         <w:t xml:space="preserve">Efinity Insurance Group Spółka </w:t>
       </w:r>
-      <w:del w:id="1001" w:author="Corsair review" w:date="2026-10-29T18:22:52Z">
+      <w:del w:id="1001" w:author="Corsair review" w:date="2026-10-29T18:24:09Z">
         <w:r>
           <w:rPr>
             <w:rFonts w:ascii="Arial" w:hAnsi="Arial" w:cs="Arial"/>
@@ -88,7 +88,7 @@
           <w:delText xml:space="preserve">Ackyjna</w:delText>
         </w:r>
       </w:del>
-      <w:ins w:id="1002" w:author="Corsair review" w:date="2026-10-29T18:22:52Z">
+      <w:ins w:id="1002" w:author="Corsair review" w:date="2026-10-29T18:24:09Z">
         <w:r>
           <w:rPr>
             <w:rFonts w:ascii="Arial" w:hAnsi="Arial" w:cs="Arial"/>
@@ -1349,7 +1349,7 @@
                 <w:szCs w:val="22"/>
               </w:rPr>
             </w:pPr>
-            <w:del w:id="1005" w:author="Corsair review" w:date="2026-10-29T18:22:52Z">
+            <w:del w:id="1005" w:author="Corsair review" w:date="2026-10-29T18:24:09Z">
               <w:r>
                 <w:rPr>
                   <w:rFonts w:ascii="Arial" w:hAnsi="Arial" w:cs="Arial"/>
@@ -1359,7 +1359,7 @@
                 <w:delText>“</w:delText>
               </w:r>
             </w:del>
-            <w:del w:id="1006" w:author="Corsair review" w:date="2026-10-29T18:22:52Z">
+            <w:del w:id="1006" w:author="Corsair review" w:date="2026-10-29T18:24:09Z">
               <w:r>
                 <w:rPr>
                   <w:rFonts w:ascii="Arial" w:hAnsi="Arial" w:cs="Arial"/>
@@ -1370,7 +1370,7 @@
                 <w:delText>FY26A Adjusted EBITDA</w:delText>
               </w:r>
             </w:del>
-            <w:del w:id="1007" w:author="Corsair review" w:date="2026-10-29T18:22:52Z">
+            <w:del w:id="1007" w:author="Corsair review" w:date="2026-10-29T18:24:09Z">
               <w:r>
                 <w:rPr>
                   <w:rFonts w:ascii="Arial" w:hAnsi="Arial" w:cs="Arial"/>
@@ -1380,7 +1380,7 @@
                 <w:delText xml:space="preserve">” means the Adjusted EBITDA of the Company for the financial year ending 31 December 2026 as shown in the Company’s FY26 </w:delText>
               </w:r>
             </w:del>
-            <w:del w:id="1008" w:author="Corsair review" w:date="2026-10-29T18:22:52Z">
+            <w:del w:id="1008" w:author="Corsair review" w:date="2026-10-29T18:24:09Z">
               <w:r>
                 <w:rPr>
                   <w:rFonts w:ascii="Arial" w:hAnsi="Arial" w:cs="Arial"/>
@@ -1390,7 +1390,7 @@
                 <w:delText>preliminary financial statements</w:delText>
               </w:r>
             </w:del>
-            <w:ins w:id="1009" w:author="Corsair review" w:date="2026-10-29T18:22:52Z">
+            <w:ins w:id="1009" w:author="Corsair review" w:date="2026-10-29T18:24:09Z">
               <w:r>
                 <w:rPr>
                   <w:rFonts w:ascii="Arial" w:hAnsi="Arial" w:cs="Arial"/>
@@ -1432,13 +1432,13 @@
               <w:ind w:left="357" w:hanging="357"/>
               <w:contextualSpacing/>
               <w:rPr>
-                <w:ins w:id="1010" w:author="Corsair review" w:date="2026-10-29T18:22:52Z"/>
+                <w:ins w:id="1010" w:author="Corsair review" w:date="2026-10-29T18:24:09Z"/>
                 <w:rFonts w:ascii="Arial" w:hAnsi="Arial" w:cs="Arial"/>
                 <w:sz w:val="22"/>
                 <w:szCs w:val="22"/>
               </w:rPr>
             </w:pPr>
-            <w:ins w:id="1011" w:author="Corsair review" w:date="2026-10-29T18:22:52Z">
+            <w:ins w:id="1011" w:author="Corsair review" w:date="2026-10-29T18:24:09Z">
               <w:r>
                 <w:rPr>
                   <w:rFonts w:ascii="Arial" w:hAnsi="Arial" w:cs="Arial"/>
@@ -1480,13 +1480,13 @@
               <w:ind w:left="357" w:hanging="357"/>
               <w:contextualSpacing/>
               <w:rPr>
-                <w:ins w:id="1012" w:author="Corsair review" w:date="2026-10-29T18:22:52Z"/>
+                <w:ins w:id="1012" w:author="Corsair review" w:date="2026-10-29T18:24:09Z"/>
                 <w:rFonts w:ascii="Arial" w:hAnsi="Arial" w:cs="Arial"/>
                 <w:sz w:val="22"/>
                 <w:szCs w:val="22"/>
               </w:rPr>
             </w:pPr>
-            <w:ins w:id="1013" w:author="Corsair review" w:date="2026-10-29T18:22:52Z">
+            <w:ins w:id="1013" w:author="Corsair review" w:date="2026-10-29T18:24:09Z">
               <w:r>
                 <w:rPr>
                   <w:rFonts w:ascii="Arial" w:hAnsi="Arial" w:cs="Arial"/>
@@ -1668,7 +1668,7 @@
                 <w:szCs w:val="22"/>
               </w:rPr>
             </w:pPr>
-            <w:del w:id="1014" w:author="Corsair review" w:date="2026-10-29T18:22:52Z">
+            <w:del w:id="1014" w:author="Corsair review" w:date="2026-10-29T18:24:09Z">
               <w:r>
                 <w:rPr>
                   <w:rFonts w:ascii="Arial" w:hAnsi="Arial" w:cs="Arial"/>
@@ -1678,7 +1678,7 @@
                 <w:delText xml:space="preserve">The FY26A </w:delText>
               </w:r>
             </w:del>
-            <w:del w:id="1015" w:author="Corsair review" w:date="2026-10-29T18:22:52Z">
+            <w:del w:id="1015" w:author="Corsair review" w:date="2026-10-29T18:24:09Z">
               <w:r>
                 <w:rPr>
                   <w:rFonts w:ascii="Arial" w:hAnsi="Arial" w:cs="Arial"/>
@@ -1688,7 +1688,7 @@
                 <w:delText xml:space="preserve">preliminary financial statements </w:delText>
               </w:r>
             </w:del>
-            <w:del w:id="1016" w:author="Corsair review" w:date="2026-10-29T18:22:52Z">
+            <w:del w:id="1016" w:author="Corsair review" w:date="2026-10-29T18:24:09Z">
               <w:r>
                 <w:rPr>
                   <w:rFonts w:ascii="Arial" w:hAnsi="Arial" w:cs="Arial"/>
@@ -1698,7 +1698,7 @@
                 <w:delText>of the Company are expected to be available in late January / early February 2027</w:delText>
               </w:r>
             </w:del>
-            <w:ins w:id="1017" w:author="Corsair review" w:date="2026-10-29T18:22:52Z">
+            <w:ins w:id="1017" w:author="Corsair review" w:date="2026-10-29T18:24:09Z">
               <w:r>
                 <w:rPr>
                   <w:rFonts w:ascii="Arial" w:hAnsi="Arial" w:cs="Arial"/>
@@ -1728,7 +1728,7 @@
                 <w:szCs w:val="22"/>
               </w:rPr>
             </w:pPr>
-            <w:del w:id="1018" w:author="Corsair review" w:date="2026-10-29T18:22:52Z">
+            <w:del w:id="1018" w:author="Corsair review" w:date="2026-10-29T18:24:09Z">
               <w:r>
                 <w:rPr>
                   <w:rFonts w:ascii="Arial" w:hAnsi="Arial" w:cs="Arial"/>
@@ -1738,7 +1738,7 @@
                 <w:delText xml:space="preserve">The </w:delText>
               </w:r>
             </w:del>
-            <w:del w:id="1019" w:author="Corsair review" w:date="2026-10-29T18:22:52Z">
+            <w:del w:id="1019" w:author="Corsair review" w:date="2026-10-29T18:24:09Z">
               <w:r>
                 <w:rPr>
                   <w:rFonts w:ascii="Arial" w:hAnsi="Arial" w:cs="Arial"/>
@@ -1748,7 +1748,7 @@
                 <w:delText xml:space="preserve">Purchase Price is fixed once the FY26A </w:delText>
               </w:r>
             </w:del>
-            <w:del w:id="1020" w:author="Corsair review" w:date="2026-10-29T18:22:52Z">
+            <w:del w:id="1020" w:author="Corsair review" w:date="2026-10-29T18:24:09Z">
               <w:r>
                 <w:rPr>
                   <w:rFonts w:ascii="Arial" w:hAnsi="Arial" w:cs="Arial"/>
@@ -1758,7 +1758,7 @@
                 <w:delText xml:space="preserve">preliminary financial statements </w:delText>
               </w:r>
             </w:del>
-            <w:del w:id="1021" w:author="Corsair review" w:date="2026-10-29T18:22:52Z">
+            <w:del w:id="1021" w:author="Corsair review" w:date="2026-10-29T18:24:09Z">
               <w:r>
                 <w:rPr>
                   <w:rFonts w:ascii="Arial" w:hAnsi="Arial" w:cs="Arial"/>
@@ -1768,7 +1768,7 @@
                 <w:delText>have been delivered, with signing of the share purchase agreement and completion following thereafter</w:delText>
               </w:r>
             </w:del>
-            <w:ins w:id="1022" w:author="Corsair review" w:date="2026-10-29T18:22:52Z">
+            <w:ins w:id="1022" w:author="Corsair review" w:date="2026-10-29T18:24:09Z">
               <w:r>
                 <w:rPr>
                   <w:rFonts w:ascii="Arial" w:hAnsi="Arial" w:cs="Arial"/>
@@ -1792,7 +1792,7 @@
                   <w:sz w:val="22"/>
                   <w:szCs w:val="22"/>
                 </w:rPr>
-                <w:t xml:space="preserve">”) will be calculated on the basis of the Preliminary FY26A Adjusted EBITDA, with signing of the share purchase agreement and completion following delivery of the FY26 preliminary financial statements. [[10]% of the Preliminary Purchase Price (the “</w:t>
+                <w:t xml:space="preserve">”) will be calculated on the basis of the Preliminary FY26A Adjusted EBITDA, with signing of the share purchase agreement and completion following delivery of the FY26 preliminary financial statements. [10]% of the Preliminary Purchase Price (the “</w:t>
               </w:r>
               <w:r>
                 <w:rPr>
@@ -1809,7 +1809,7 @@
                   <w:sz w:val="22"/>
                   <w:szCs w:val="22"/>
                 </w:rPr>
-                <w:t xml:space="preserve">”) will be retained by CEIS at completion pending the adjustment below]</w:t>
+                <w:t xml:space="preserve">”) will be retained by CEIS at completion as security for any downward adjustment under the mechanism below</w:t>
               </w:r>
             </w:ins>
           </w:p>
@@ -1827,13 +1827,13 @@
               <w:ind w:left="357" w:hanging="357"/>
               <w:contextualSpacing/>
               <w:rPr>
-                <w:ins w:id="1023" w:author="Corsair review" w:date="2026-10-29T18:22:52Z"/>
+                <w:ins w:id="1023" w:author="Corsair review" w:date="2026-10-29T18:24:09Z"/>
                 <w:rFonts w:ascii="Arial" w:hAnsi="Arial" w:cs="Arial"/>
                 <w:sz w:val="22"/>
                 <w:szCs w:val="22"/>
               </w:rPr>
             </w:pPr>
-            <w:ins w:id="1024" w:author="Corsair review" w:date="2026-10-29T18:22:52Z">
+            <w:ins w:id="1024" w:author="Corsair review" w:date="2026-10-29T18:24:09Z">
               <w:r>
                 <w:rPr>
                   <w:rFonts w:ascii="Arial" w:hAnsi="Arial" w:cs="Arial"/>
@@ -1892,20 +1892,20 @@
               <w:ind w:left="357" w:hanging="357"/>
               <w:contextualSpacing/>
               <w:rPr>
-                <w:ins w:id="1025" w:author="Corsair review" w:date="2026-10-29T18:22:52Z"/>
+                <w:ins w:id="1025" w:author="Corsair review" w:date="2026-10-29T18:24:09Z"/>
                 <w:rFonts w:ascii="Arial" w:hAnsi="Arial" w:cs="Arial"/>
                 <w:sz w:val="22"/>
                 <w:szCs w:val="22"/>
               </w:rPr>
             </w:pPr>
-            <w:ins w:id="1026" w:author="Corsair review" w:date="2026-10-29T18:22:52Z">
+            <w:ins w:id="1026" w:author="Corsair review" w:date="2026-10-29T18:24:09Z">
               <w:r>
                 <w:rPr>
                   <w:rFonts w:ascii="Arial" w:hAnsi="Arial" w:cs="Arial"/>
                   <w:sz w:val="22"/>
                   <w:szCs w:val="22"/>
                 </w:rPr>
-                <w:t xml:space="preserve">If the Final FY26A Adjusted EBITDA is greater than 105% or less than 95% of the Preliminary FY26A Adjusted EBITDA, the Purchase Price will be adjusted to the Final Purchase Price and [the full difference] / [only the amount by which the difference exceeds 5% of the Preliminary Purchase Price] will be paid: by CEIS to Efinity if the Final Purchase Price is higher; or by Efinity to CEIS [first by release of the Holdback Amount and then in cash for any excess] if it is lower. If the Final FY26A Adjusted EBITDA is within that range, no adjustment will be made and the Preliminary Purchase Price will be the Purchase Price [and the Holdback Amount will be released to Efinity]</w:t>
+                <w:t xml:space="preserve">The Purchase Price will be adjusted to the Final Purchase Price and the difference will be paid: by CEIS to Efinity if the Final Purchase Price is higher than the Preliminary Purchase Price; or by Efinity to CEIS, first by release of the Holdback Amount to CEIS and then in cash for any excess, if it is lower. If the difference is less than [1]% of the Preliminary Purchase Price no adjustment payment will be made and the Preliminary Purchase Price will be the Purchase Price. Any part of the Holdback Amount not applied against a downward adjustment will be released to Efinity within [10] Business Days of the Adjustment Statement becoming final</w:t>
               </w:r>
             </w:ins>
           </w:p>
@@ -1923,13 +1923,13 @@
               <w:ind w:left="357" w:hanging="357"/>
               <w:contextualSpacing/>
               <w:rPr>
-                <w:ins w:id="1027" w:author="Corsair review" w:date="2026-10-29T18:22:52Z"/>
+                <w:ins w:id="1027" w:author="Corsair review" w:date="2026-10-29T18:24:09Z"/>
                 <w:rFonts w:ascii="Arial" w:hAnsi="Arial" w:cs="Arial"/>
                 <w:sz w:val="22"/>
                 <w:szCs w:val="22"/>
               </w:rPr>
             </w:pPr>
-            <w:ins w:id="1028" w:author="Corsair review" w:date="2026-10-29T18:22:52Z">
+            <w:ins w:id="1028" w:author="Corsair review" w:date="2026-10-29T18:24:09Z">
               <w:r>
                 <w:rPr>
                   <w:rFonts w:ascii="Arial" w:hAnsi="Arial" w:cs="Arial"/>
@@ -1954,13 +1954,13 @@
               <w:ind w:left="357" w:hanging="357"/>
               <w:contextualSpacing/>
               <w:rPr>
-                <w:ins w:id="1029" w:author="Corsair review" w:date="2026-10-29T18:22:52Z"/>
+                <w:ins w:id="1029" w:author="Corsair review" w:date="2026-10-29T18:24:09Z"/>
                 <w:rFonts w:ascii="Arial" w:hAnsi="Arial" w:cs="Arial"/>
                 <w:sz w:val="22"/>
                 <w:szCs w:val="22"/>
               </w:rPr>
             </w:pPr>
-            <w:ins w:id="1030" w:author="Corsair review" w:date="2026-10-29T18:22:52Z">
+            <w:ins w:id="1030" w:author="Corsair review" w:date="2026-10-29T18:24:09Z">
               <w:r>
                 <w:rPr>
                   <w:rFonts w:ascii="Arial" w:hAnsi="Arial" w:cs="Arial"/>
@@ -2308,7 +2308,7 @@
               </w:rPr>
               <w:t xml:space="preserve">financial statements and agreement of the </w:t>
             </w:r>
-            <w:del w:id="1031" w:author="Corsair review" w:date="2026-10-29T18:22:52Z">
+            <w:del w:id="1031" w:author="Corsair review" w:date="2026-10-29T18:24:09Z">
               <w:r>
                 <w:rPr>
                   <w:rFonts w:ascii="Arial" w:hAnsi="Arial" w:cs="Arial"/>
@@ -2318,7 +2318,7 @@
                 <w:delText xml:space="preserve">final Purchase Price</w:delText>
               </w:r>
             </w:del>
-            <w:ins w:id="1032" w:author="Corsair review" w:date="2026-10-29T18:22:52Z">
+            <w:ins w:id="1032" w:author="Corsair review" w:date="2026-10-29T18:24:09Z">
               <w:r>
                 <w:rPr>
                   <w:rFonts w:ascii="Arial" w:hAnsi="Arial" w:cs="Arial"/>
@@ -2662,7 +2662,7 @@
               </w:rPr>
               <w:t>short form</w:t>
             </w:r>
-            <w:del w:id="1033" w:author="Corsair review" w:date="2026-10-29T18:22:52Z">
+            <w:del w:id="1033" w:author="Corsair review" w:date="2026-10-29T18:24:09Z">
               <w:r>
                 <w:rPr>
                   <w:rFonts w:ascii="Arial" w:hAnsi="Arial" w:cs="Arial"/>
@@ -2672,7 +2672,7 @@
                 <w:delText xml:space="preserve"> share purchase agreement,</w:delText>
               </w:r>
             </w:del>
-            <w:ins w:id="1034" w:author="Corsair review" w:date="2026-10-29T18:22:52Z">
+            <w:ins w:id="1034" w:author="Corsair review" w:date="2026-10-29T18:24:09Z">
               <w:r>
                 <w:rPr>
                   <w:rFonts w:ascii="Arial" w:hAnsi="Arial" w:cs="Arial"/>
@@ -3086,7 +3086,7 @@
                 <w:szCs w:val="22"/>
               </w:rPr>
             </w:pPr>
-            <w:del w:id="1035" w:author="Corsair review" w:date="2026-10-29T18:22:52Z">
+            <w:del w:id="1035" w:author="Corsair review" w:date="2026-10-29T18:24:09Z">
               <w:r>
                 <w:rPr>
                   <w:rFonts w:ascii="Arial" w:hAnsi="Arial" w:cs="Arial"/>
@@ -3097,7 +3097,7 @@
                 <w:delText>To check in the context of the SHA</w:delText>
               </w:r>
             </w:del>
-            <w:ins w:id="1036" w:author="Corsair review" w:date="2026-10-29T18:22:52Z">
+            <w:ins w:id="1036" w:author="Corsair review" w:date="2026-10-29T18:24:09Z">
               <w:r>
                 <w:rPr>
                   <w:rFonts w:ascii="Arial" w:hAnsi="Arial" w:cs="Arial"/>
@@ -3122,13 +3122,13 @@
               <w:ind w:left="357" w:hanging="357"/>
               <w:contextualSpacing/>
               <w:rPr>
-                <w:ins w:id="1037" w:author="Corsair review" w:date="2026-10-29T18:22:52Z"/>
+                <w:ins w:id="1037" w:author="Corsair review" w:date="2026-10-29T18:24:09Z"/>
                 <w:rFonts w:ascii="Arial" w:hAnsi="Arial" w:cs="Arial"/>
                 <w:sz w:val="22"/>
                 <w:szCs w:val="22"/>
               </w:rPr>
             </w:pPr>
-            <w:ins w:id="1038" w:author="Corsair review" w:date="2026-10-29T18:22:52Z">
+            <w:ins w:id="1038" w:author="Corsair review" w:date="2026-10-29T18:24:09Z">
               <w:r>
                 <w:rPr>
                   <w:rFonts w:ascii="Arial" w:hAnsi="Arial" w:cs="Arial"/>
@@ -3153,13 +3153,13 @@
               <w:ind w:left="357" w:hanging="357"/>
               <w:contextualSpacing/>
               <w:rPr>
-                <w:ins w:id="1039" w:author="Corsair review" w:date="2026-10-29T18:22:52Z"/>
+                <w:ins w:id="1039" w:author="Corsair review" w:date="2026-10-29T18:24:09Z"/>
                 <w:rFonts w:ascii="Arial" w:hAnsi="Arial" w:cs="Arial"/>
                 <w:sz w:val="22"/>
                 <w:szCs w:val="22"/>
               </w:rPr>
             </w:pPr>
-            <w:ins w:id="1040" w:author="Corsair review" w:date="2026-10-29T18:22:52Z">
+            <w:ins w:id="1040" w:author="Corsair review" w:date="2026-10-29T18:24:09Z">
               <w:r>
                 <w:rPr>
                   <w:rFonts w:ascii="Arial" w:hAnsi="Arial" w:cs="Arial"/>
@@ -3338,7 +3338,7 @@
               </w:rPr>
               <w:t xml:space="preserve">Agreement of </w:t>
             </w:r>
-            <w:del w:id="1041" w:author="Corsair review" w:date="2026-10-29T18:22:52Z">
+            <w:del w:id="1041" w:author="Corsair review" w:date="2026-10-29T18:24:09Z">
               <w:r>
                 <w:rPr>
                   <w:rFonts w:ascii="Arial" w:hAnsi="Arial" w:cs="Arial"/>
@@ -3348,7 +3348,7 @@
                 <w:delText xml:space="preserve">final Purchase Price</w:delText>
               </w:r>
             </w:del>
-            <w:ins w:id="1042" w:author="Corsair review" w:date="2026-10-29T18:22:52Z">
+            <w:ins w:id="1042" w:author="Corsair review" w:date="2026-10-29T18:24:09Z">
               <w:r>
                 <w:rPr>
                   <w:rFonts w:ascii="Arial" w:hAnsi="Arial" w:cs="Arial"/>
@@ -3436,7 +3436,7 @@
                 <w:szCs w:val="22"/>
               </w:rPr>
             </w:pPr>
-            <w:del w:id="1043" w:author="Corsair review" w:date="2026-10-29T18:22:52Z">
+            <w:del w:id="1043" w:author="Corsair review" w:date="2026-10-29T18:24:09Z">
               <w:r>
                 <w:rPr>
                   <w:rFonts w:ascii="Arial" w:hAnsi="Arial" w:cs="Arial"/>
@@ -3447,7 +3447,7 @@
                 <w:delText>Adjustment period / remediation?</w:delText>
               </w:r>
             </w:del>
-            <w:del w:id="1044" w:author="Corsair review" w:date="2026-10-29T18:22:52Z">
+            <w:del w:id="1044" w:author="Corsair review" w:date="2026-10-29T18:24:09Z">
               <w:r>
                 <w:rPr>
                   <w:rFonts w:ascii="Arial" w:hAnsi="Arial" w:cs="Arial"/>
@@ -3457,7 +3457,7 @@
                 <w:delText xml:space="preserve"> </w:delText>
               </w:r>
             </w:del>
-            <w:ins w:id="1045" w:author="Corsair review" w:date="2026-10-29T18:22:52Z">
+            <w:ins w:id="1045" w:author="Corsair review" w:date="2026-10-29T18:24:09Z">
               <w:r>
                 <w:rPr>
                   <w:rFonts w:ascii="Arial" w:hAnsi="Arial" w:cs="Arial"/>
@@ -3481,13 +3481,13 @@
               <w:spacing w:before="120" w:after="288" w:line="276" w:lineRule="auto"/>
               <w:contextualSpacing/>
               <w:rPr>
-                <w:ins w:id="1046" w:author="Corsair review" w:date="2026-10-29T18:22:52Z"/>
+                <w:ins w:id="1046" w:author="Corsair review" w:date="2026-10-29T18:24:09Z"/>
                 <w:rFonts w:ascii="Arial" w:hAnsi="Arial" w:cs="Arial"/>
                 <w:sz w:val="22"/>
                 <w:szCs w:val="22"/>
               </w:rPr>
             </w:pPr>
-            <w:ins w:id="1047" w:author="Corsair review" w:date="2026-10-29T18:22:52Z">
+            <w:ins w:id="1047" w:author="Corsair review" w:date="2026-10-29T18:24:09Z">
               <w:r>
                 <w:rPr>
                   <w:rFonts w:ascii="Arial" w:hAnsi="Arial" w:cs="Arial"/>
@@ -3948,7 +3948,7 @@
         </w:rPr>
         <w:t xml:space="preserve">EFINITY INSURANCE GROUP SPÓŁKA </w:t>
       </w:r>
-      <w:del w:id="1003" w:author="Corsair review" w:date="2026-10-29T18:22:52Z">
+      <w:del w:id="1003" w:author="Corsair review" w:date="2026-10-29T18:24:09Z">
         <w:r>
           <w:rPr>
             <w:rFonts w:ascii="Arial" w:hAnsi="Arial" w:cs="Arial"/>
@@ -3958,7 +3958,7 @@
           <w:delText xml:space="preserve">ACKYJNA</w:delText>
         </w:r>
       </w:del>
-      <w:ins w:id="1004" w:author="Corsair review" w:date="2026-10-29T18:22:52Z">
+      <w:ins w:id="1004" w:author="Corsair review" w:date="2026-10-29T18:24:09Z">
         <w:r>
           <w:rPr>
             <w:rFonts w:ascii="Arial" w:hAnsi="Arial" w:cs="Arial"/>

</xml_diff>

<commit_message>
Reframe non-compete acknowledgement around the Managers
Co-Authored-By: Claude Fable 5.1 <noreply@anthropic.com>
Claude-Session: https://claude.ai/code/session_017WXGuxbkZxKJPwstVR3guK
</commit_message>
<xml_diff>
--- a/MJM - Secondary Term Sheet v20261029_1735 - Corsair markup.docx
+++ b/MJM - Secondary Term Sheet v20261029_1735 - Corsair markup.docx
@@ -80,7 +80,7 @@
         </w:rPr>
         <w:t xml:space="preserve">Efinity Insurance Group Spółka </w:t>
       </w:r>
-      <w:del w:id="1001" w:author="Corsair review" w:date="2026-10-29T18:24:09Z">
+      <w:del w:id="1001" w:author="Corsair review" w:date="2026-10-29T18:28:47Z">
         <w:r>
           <w:rPr>
             <w:rFonts w:ascii="Arial" w:hAnsi="Arial" w:cs="Arial"/>
@@ -88,7 +88,7 @@
           <w:delText xml:space="preserve">Ackyjna</w:delText>
         </w:r>
       </w:del>
-      <w:ins w:id="1002" w:author="Corsair review" w:date="2026-10-29T18:24:09Z">
+      <w:ins w:id="1002" w:author="Corsair review" w:date="2026-10-29T18:28:47Z">
         <w:r>
           <w:rPr>
             <w:rFonts w:ascii="Arial" w:hAnsi="Arial" w:cs="Arial"/>
@@ -1349,7 +1349,7 @@
                 <w:szCs w:val="22"/>
               </w:rPr>
             </w:pPr>
-            <w:del w:id="1005" w:author="Corsair review" w:date="2026-10-29T18:24:09Z">
+            <w:del w:id="1005" w:author="Corsair review" w:date="2026-10-29T18:28:47Z">
               <w:r>
                 <w:rPr>
                   <w:rFonts w:ascii="Arial" w:hAnsi="Arial" w:cs="Arial"/>
@@ -1359,7 +1359,7 @@
                 <w:delText>“</w:delText>
               </w:r>
             </w:del>
-            <w:del w:id="1006" w:author="Corsair review" w:date="2026-10-29T18:24:09Z">
+            <w:del w:id="1006" w:author="Corsair review" w:date="2026-10-29T18:28:47Z">
               <w:r>
                 <w:rPr>
                   <w:rFonts w:ascii="Arial" w:hAnsi="Arial" w:cs="Arial"/>
@@ -1370,7 +1370,7 @@
                 <w:delText>FY26A Adjusted EBITDA</w:delText>
               </w:r>
             </w:del>
-            <w:del w:id="1007" w:author="Corsair review" w:date="2026-10-29T18:24:09Z">
+            <w:del w:id="1007" w:author="Corsair review" w:date="2026-10-29T18:28:47Z">
               <w:r>
                 <w:rPr>
                   <w:rFonts w:ascii="Arial" w:hAnsi="Arial" w:cs="Arial"/>
@@ -1380,7 +1380,7 @@
                 <w:delText xml:space="preserve">” means the Adjusted EBITDA of the Company for the financial year ending 31 December 2026 as shown in the Company’s FY26 </w:delText>
               </w:r>
             </w:del>
-            <w:del w:id="1008" w:author="Corsair review" w:date="2026-10-29T18:24:09Z">
+            <w:del w:id="1008" w:author="Corsair review" w:date="2026-10-29T18:28:47Z">
               <w:r>
                 <w:rPr>
                   <w:rFonts w:ascii="Arial" w:hAnsi="Arial" w:cs="Arial"/>
@@ -1390,7 +1390,7 @@
                 <w:delText>preliminary financial statements</w:delText>
               </w:r>
             </w:del>
-            <w:ins w:id="1009" w:author="Corsair review" w:date="2026-10-29T18:24:09Z">
+            <w:ins w:id="1009" w:author="Corsair review" w:date="2026-10-29T18:28:47Z">
               <w:r>
                 <w:rPr>
                   <w:rFonts w:ascii="Arial" w:hAnsi="Arial" w:cs="Arial"/>
@@ -1432,13 +1432,13 @@
               <w:ind w:left="357" w:hanging="357"/>
               <w:contextualSpacing/>
               <w:rPr>
-                <w:ins w:id="1010" w:author="Corsair review" w:date="2026-10-29T18:24:09Z"/>
+                <w:ins w:id="1010" w:author="Corsair review" w:date="2026-10-29T18:28:47Z"/>
                 <w:rFonts w:ascii="Arial" w:hAnsi="Arial" w:cs="Arial"/>
                 <w:sz w:val="22"/>
                 <w:szCs w:val="22"/>
               </w:rPr>
             </w:pPr>
-            <w:ins w:id="1011" w:author="Corsair review" w:date="2026-10-29T18:24:09Z">
+            <w:ins w:id="1011" w:author="Corsair review" w:date="2026-10-29T18:28:47Z">
               <w:r>
                 <w:rPr>
                   <w:rFonts w:ascii="Arial" w:hAnsi="Arial" w:cs="Arial"/>
@@ -1480,13 +1480,13 @@
               <w:ind w:left="357" w:hanging="357"/>
               <w:contextualSpacing/>
               <w:rPr>
-                <w:ins w:id="1012" w:author="Corsair review" w:date="2026-10-29T18:24:09Z"/>
+                <w:ins w:id="1012" w:author="Corsair review" w:date="2026-10-29T18:28:47Z"/>
                 <w:rFonts w:ascii="Arial" w:hAnsi="Arial" w:cs="Arial"/>
                 <w:sz w:val="22"/>
                 <w:szCs w:val="22"/>
               </w:rPr>
             </w:pPr>
-            <w:ins w:id="1013" w:author="Corsair review" w:date="2026-10-29T18:24:09Z">
+            <w:ins w:id="1013" w:author="Corsair review" w:date="2026-10-29T18:28:47Z">
               <w:r>
                 <w:rPr>
                   <w:rFonts w:ascii="Arial" w:hAnsi="Arial" w:cs="Arial"/>
@@ -1668,7 +1668,7 @@
                 <w:szCs w:val="22"/>
               </w:rPr>
             </w:pPr>
-            <w:del w:id="1014" w:author="Corsair review" w:date="2026-10-29T18:24:09Z">
+            <w:del w:id="1014" w:author="Corsair review" w:date="2026-10-29T18:28:47Z">
               <w:r>
                 <w:rPr>
                   <w:rFonts w:ascii="Arial" w:hAnsi="Arial" w:cs="Arial"/>
@@ -1678,7 +1678,7 @@
                 <w:delText xml:space="preserve">The FY26A </w:delText>
               </w:r>
             </w:del>
-            <w:del w:id="1015" w:author="Corsair review" w:date="2026-10-29T18:24:09Z">
+            <w:del w:id="1015" w:author="Corsair review" w:date="2026-10-29T18:28:47Z">
               <w:r>
                 <w:rPr>
                   <w:rFonts w:ascii="Arial" w:hAnsi="Arial" w:cs="Arial"/>
@@ -1688,7 +1688,7 @@
                 <w:delText xml:space="preserve">preliminary financial statements </w:delText>
               </w:r>
             </w:del>
-            <w:del w:id="1016" w:author="Corsair review" w:date="2026-10-29T18:24:09Z">
+            <w:del w:id="1016" w:author="Corsair review" w:date="2026-10-29T18:28:47Z">
               <w:r>
                 <w:rPr>
                   <w:rFonts w:ascii="Arial" w:hAnsi="Arial" w:cs="Arial"/>
@@ -1698,7 +1698,7 @@
                 <w:delText>of the Company are expected to be available in late January / early February 2027</w:delText>
               </w:r>
             </w:del>
-            <w:ins w:id="1017" w:author="Corsair review" w:date="2026-10-29T18:24:09Z">
+            <w:ins w:id="1017" w:author="Corsair review" w:date="2026-10-29T18:28:47Z">
               <w:r>
                 <w:rPr>
                   <w:rFonts w:ascii="Arial" w:hAnsi="Arial" w:cs="Arial"/>
@@ -1728,7 +1728,7 @@
                 <w:szCs w:val="22"/>
               </w:rPr>
             </w:pPr>
-            <w:del w:id="1018" w:author="Corsair review" w:date="2026-10-29T18:24:09Z">
+            <w:del w:id="1018" w:author="Corsair review" w:date="2026-10-29T18:28:47Z">
               <w:r>
                 <w:rPr>
                   <w:rFonts w:ascii="Arial" w:hAnsi="Arial" w:cs="Arial"/>
@@ -1738,7 +1738,7 @@
                 <w:delText xml:space="preserve">The </w:delText>
               </w:r>
             </w:del>
-            <w:del w:id="1019" w:author="Corsair review" w:date="2026-10-29T18:24:09Z">
+            <w:del w:id="1019" w:author="Corsair review" w:date="2026-10-29T18:28:47Z">
               <w:r>
                 <w:rPr>
                   <w:rFonts w:ascii="Arial" w:hAnsi="Arial" w:cs="Arial"/>
@@ -1748,7 +1748,7 @@
                 <w:delText xml:space="preserve">Purchase Price is fixed once the FY26A </w:delText>
               </w:r>
             </w:del>
-            <w:del w:id="1020" w:author="Corsair review" w:date="2026-10-29T18:24:09Z">
+            <w:del w:id="1020" w:author="Corsair review" w:date="2026-10-29T18:28:47Z">
               <w:r>
                 <w:rPr>
                   <w:rFonts w:ascii="Arial" w:hAnsi="Arial" w:cs="Arial"/>
@@ -1758,7 +1758,7 @@
                 <w:delText xml:space="preserve">preliminary financial statements </w:delText>
               </w:r>
             </w:del>
-            <w:del w:id="1021" w:author="Corsair review" w:date="2026-10-29T18:24:09Z">
+            <w:del w:id="1021" w:author="Corsair review" w:date="2026-10-29T18:28:47Z">
               <w:r>
                 <w:rPr>
                   <w:rFonts w:ascii="Arial" w:hAnsi="Arial" w:cs="Arial"/>
@@ -1768,7 +1768,7 @@
                 <w:delText>have been delivered, with signing of the share purchase agreement and completion following thereafter</w:delText>
               </w:r>
             </w:del>
-            <w:ins w:id="1022" w:author="Corsair review" w:date="2026-10-29T18:24:09Z">
+            <w:ins w:id="1022" w:author="Corsair review" w:date="2026-10-29T18:28:47Z">
               <w:r>
                 <w:rPr>
                   <w:rFonts w:ascii="Arial" w:hAnsi="Arial" w:cs="Arial"/>
@@ -1827,13 +1827,13 @@
               <w:ind w:left="357" w:hanging="357"/>
               <w:contextualSpacing/>
               <w:rPr>
-                <w:ins w:id="1023" w:author="Corsair review" w:date="2026-10-29T18:24:09Z"/>
+                <w:ins w:id="1023" w:author="Corsair review" w:date="2026-10-29T18:28:47Z"/>
                 <w:rFonts w:ascii="Arial" w:hAnsi="Arial" w:cs="Arial"/>
                 <w:sz w:val="22"/>
                 <w:szCs w:val="22"/>
               </w:rPr>
             </w:pPr>
-            <w:ins w:id="1024" w:author="Corsair review" w:date="2026-10-29T18:24:09Z">
+            <w:ins w:id="1024" w:author="Corsair review" w:date="2026-10-29T18:28:47Z">
               <w:r>
                 <w:rPr>
                   <w:rFonts w:ascii="Arial" w:hAnsi="Arial" w:cs="Arial"/>
@@ -1892,13 +1892,13 @@
               <w:ind w:left="357" w:hanging="357"/>
               <w:contextualSpacing/>
               <w:rPr>
-                <w:ins w:id="1025" w:author="Corsair review" w:date="2026-10-29T18:24:09Z"/>
+                <w:ins w:id="1025" w:author="Corsair review" w:date="2026-10-29T18:28:47Z"/>
                 <w:rFonts w:ascii="Arial" w:hAnsi="Arial" w:cs="Arial"/>
                 <w:sz w:val="22"/>
                 <w:szCs w:val="22"/>
               </w:rPr>
             </w:pPr>
-            <w:ins w:id="1026" w:author="Corsair review" w:date="2026-10-29T18:24:09Z">
+            <w:ins w:id="1026" w:author="Corsair review" w:date="2026-10-29T18:28:47Z">
               <w:r>
                 <w:rPr>
                   <w:rFonts w:ascii="Arial" w:hAnsi="Arial" w:cs="Arial"/>
@@ -1923,13 +1923,13 @@
               <w:ind w:left="357" w:hanging="357"/>
               <w:contextualSpacing/>
               <w:rPr>
-                <w:ins w:id="1027" w:author="Corsair review" w:date="2026-10-29T18:24:09Z"/>
+                <w:ins w:id="1027" w:author="Corsair review" w:date="2026-10-29T18:28:47Z"/>
                 <w:rFonts w:ascii="Arial" w:hAnsi="Arial" w:cs="Arial"/>
                 <w:sz w:val="22"/>
                 <w:szCs w:val="22"/>
               </w:rPr>
             </w:pPr>
-            <w:ins w:id="1028" w:author="Corsair review" w:date="2026-10-29T18:24:09Z">
+            <w:ins w:id="1028" w:author="Corsair review" w:date="2026-10-29T18:28:47Z">
               <w:r>
                 <w:rPr>
                   <w:rFonts w:ascii="Arial" w:hAnsi="Arial" w:cs="Arial"/>
@@ -1954,13 +1954,13 @@
               <w:ind w:left="357" w:hanging="357"/>
               <w:contextualSpacing/>
               <w:rPr>
-                <w:ins w:id="1029" w:author="Corsair review" w:date="2026-10-29T18:24:09Z"/>
+                <w:ins w:id="1029" w:author="Corsair review" w:date="2026-10-29T18:28:47Z"/>
                 <w:rFonts w:ascii="Arial" w:hAnsi="Arial" w:cs="Arial"/>
                 <w:sz w:val="22"/>
                 <w:szCs w:val="22"/>
               </w:rPr>
             </w:pPr>
-            <w:ins w:id="1030" w:author="Corsair review" w:date="2026-10-29T18:24:09Z">
+            <w:ins w:id="1030" w:author="Corsair review" w:date="2026-10-29T18:28:47Z">
               <w:r>
                 <w:rPr>
                   <w:rFonts w:ascii="Arial" w:hAnsi="Arial" w:cs="Arial"/>
@@ -2308,7 +2308,7 @@
               </w:rPr>
               <w:t xml:space="preserve">financial statements and agreement of the </w:t>
             </w:r>
-            <w:del w:id="1031" w:author="Corsair review" w:date="2026-10-29T18:24:09Z">
+            <w:del w:id="1031" w:author="Corsair review" w:date="2026-10-29T18:28:47Z">
               <w:r>
                 <w:rPr>
                   <w:rFonts w:ascii="Arial" w:hAnsi="Arial" w:cs="Arial"/>
@@ -2318,7 +2318,7 @@
                 <w:delText xml:space="preserve">final Purchase Price</w:delText>
               </w:r>
             </w:del>
-            <w:ins w:id="1032" w:author="Corsair review" w:date="2026-10-29T18:24:09Z">
+            <w:ins w:id="1032" w:author="Corsair review" w:date="2026-10-29T18:28:47Z">
               <w:r>
                 <w:rPr>
                   <w:rFonts w:ascii="Arial" w:hAnsi="Arial" w:cs="Arial"/>
@@ -2662,7 +2662,7 @@
               </w:rPr>
               <w:t>short form</w:t>
             </w:r>
-            <w:del w:id="1033" w:author="Corsair review" w:date="2026-10-29T18:24:09Z">
+            <w:del w:id="1033" w:author="Corsair review" w:date="2026-10-29T18:28:47Z">
               <w:r>
                 <w:rPr>
                   <w:rFonts w:ascii="Arial" w:hAnsi="Arial" w:cs="Arial"/>
@@ -2672,7 +2672,7 @@
                 <w:delText xml:space="preserve"> share purchase agreement,</w:delText>
               </w:r>
             </w:del>
-            <w:ins w:id="1034" w:author="Corsair review" w:date="2026-10-29T18:24:09Z">
+            <w:ins w:id="1034" w:author="Corsair review" w:date="2026-10-29T18:28:47Z">
               <w:r>
                 <w:rPr>
                   <w:rFonts w:ascii="Arial" w:hAnsi="Arial" w:cs="Arial"/>
@@ -3086,7 +3086,7 @@
                 <w:szCs w:val="22"/>
               </w:rPr>
             </w:pPr>
-            <w:del w:id="1035" w:author="Corsair review" w:date="2026-10-29T18:24:09Z">
+            <w:del w:id="1035" w:author="Corsair review" w:date="2026-10-29T18:28:47Z">
               <w:r>
                 <w:rPr>
                   <w:rFonts w:ascii="Arial" w:hAnsi="Arial" w:cs="Arial"/>
@@ -3097,14 +3097,14 @@
                 <w:delText>To check in the context of the SHA</w:delText>
               </w:r>
             </w:del>
-            <w:ins w:id="1036" w:author="Corsair review" w:date="2026-10-29T18:24:09Z">
+            <w:ins w:id="1036" w:author="Corsair review" w:date="2026-10-29T18:28:47Z">
               <w:r>
                 <w:rPr>
                   <w:rFonts w:ascii="Arial" w:hAnsi="Arial" w:cs="Arial"/>
                   <w:sz w:val="22"/>
                   <w:szCs w:val="22"/>
                 </w:rPr>
-                <w:t xml:space="preserve">Efinity acknowledges that, on completion, it will cease to be a party to the SHA in accordance with clause 30.2 of the SHA but that the restrictive covenants in clause 19 (Restrictive Covenants) of the SHA and the Surviving Clauses (as defined in the SHA) will continue to bind it in accordance with their terms for the Restricted Period (as defined in the SHA)</w:t>
+                <w:t xml:space="preserve">The restrictive covenants in clause 19 (Restrictive Covenants) of the SHA apply to each Manager (as defined in the SHA). Each of Maciej Bud-Gusaim, Marcin Chałtowski, Jakub Bednarski and Markos Kologeras is a Strip Manager and Key Manager under the SHA in his own right, and Efinity is a Corporate Strip Manager under the SHA</w:t>
               </w:r>
             </w:ins>
           </w:p>
@@ -3122,20 +3122,20 @@
               <w:ind w:left="357" w:hanging="357"/>
               <w:contextualSpacing/>
               <w:rPr>
-                <w:ins w:id="1037" w:author="Corsair review" w:date="2026-10-29T18:24:09Z"/>
+                <w:ins w:id="1037" w:author="Corsair review" w:date="2026-10-29T18:28:47Z"/>
                 <w:rFonts w:ascii="Arial" w:hAnsi="Arial" w:cs="Arial"/>
                 <w:sz w:val="22"/>
                 <w:szCs w:val="22"/>
               </w:rPr>
             </w:pPr>
-            <w:ins w:id="1038" w:author="Corsair review" w:date="2026-10-29T18:24:09Z">
+            <w:ins w:id="1038" w:author="Corsair review" w:date="2026-10-29T18:28:47Z">
               <w:r>
                 <w:rPr>
                   <w:rFonts w:ascii="Arial" w:hAnsi="Arial" w:cs="Arial"/>
                   <w:sz w:val="22"/>
                   <w:szCs w:val="22"/>
                 </w:rPr>
-                <w:t xml:space="preserve">For the avoidance of doubt, each of Maciej Bud-Gusaim, Marcin Chałtowski, Jakub Bednarski and Markos Kologeras is a Strip Manager and Key Manager under the SHA in his own right and remains bound by clause 19 of the SHA in that capacity for the Restricted Period applicable to him, which is not affected by the Proposed Transaction. Efinity will procure that each of them acknowledges the same in the share purchase agreement</w:t>
+                <w:t xml:space="preserve">Each of those Managers will remain bound by clause 19 of the SHA for the Restricted Period applicable to him or it (being the earlier of 24 months after he or it ceases to hold any Securities and 60 months from the date of his or its adherence to the SHA), and clause 30.2 of the SHA preserves those obligations notwithstanding that Efinity will cease to be a party to the SHA on completion</w:t>
               </w:r>
             </w:ins>
           </w:p>
@@ -3153,20 +3153,20 @@
               <w:ind w:left="357" w:hanging="357"/>
               <w:contextualSpacing/>
               <w:rPr>
-                <w:ins w:id="1039" w:author="Corsair review" w:date="2026-10-29T18:24:09Z"/>
+                <w:ins w:id="1039" w:author="Corsair review" w:date="2026-10-29T18:28:47Z"/>
                 <w:rFonts w:ascii="Arial" w:hAnsi="Arial" w:cs="Arial"/>
                 <w:sz w:val="22"/>
                 <w:szCs w:val="22"/>
               </w:rPr>
             </w:pPr>
-            <w:ins w:id="1040" w:author="Corsair review" w:date="2026-10-29T18:24:09Z">
+            <w:ins w:id="1040" w:author="Corsair review" w:date="2026-10-29T18:28:47Z">
               <w:r>
                 <w:rPr>
                   <w:rFonts w:ascii="Arial" w:hAnsi="Arial" w:cs="Arial"/>
                   <w:sz w:val="22"/>
                   <w:szCs w:val="22"/>
                 </w:rPr>
-                <w:t xml:space="preserve">Nothing in the Proposed Transaction or the transaction documents will waive, release or shorten those obligations, and any SHA consent or waiver obtained for the purposes of the Proposed Transaction will be limited accordingly</w:t>
+                <w:t xml:space="preserve">Nothing in the Proposed Transaction or the transaction documents will waive, release or shorten those obligations, and any SHA consent or waiver obtained for the purposes of the Proposed Transaction will be limited accordingly. Efinity will procure that each of the individuals named above acknowledges the same in the share purchase agreement</w:t>
               </w:r>
             </w:ins>
           </w:p>
@@ -3338,7 +3338,7 @@
               </w:rPr>
               <w:t xml:space="preserve">Agreement of </w:t>
             </w:r>
-            <w:del w:id="1041" w:author="Corsair review" w:date="2026-10-29T18:24:09Z">
+            <w:del w:id="1041" w:author="Corsair review" w:date="2026-10-29T18:28:47Z">
               <w:r>
                 <w:rPr>
                   <w:rFonts w:ascii="Arial" w:hAnsi="Arial" w:cs="Arial"/>
@@ -3348,7 +3348,7 @@
                 <w:delText xml:space="preserve">final Purchase Price</w:delText>
               </w:r>
             </w:del>
-            <w:ins w:id="1042" w:author="Corsair review" w:date="2026-10-29T18:24:09Z">
+            <w:ins w:id="1042" w:author="Corsair review" w:date="2026-10-29T18:28:47Z">
               <w:r>
                 <w:rPr>
                   <w:rFonts w:ascii="Arial" w:hAnsi="Arial" w:cs="Arial"/>
@@ -3436,7 +3436,7 @@
                 <w:szCs w:val="22"/>
               </w:rPr>
             </w:pPr>
-            <w:del w:id="1043" w:author="Corsair review" w:date="2026-10-29T18:24:09Z">
+            <w:del w:id="1043" w:author="Corsair review" w:date="2026-10-29T18:28:47Z">
               <w:r>
                 <w:rPr>
                   <w:rFonts w:ascii="Arial" w:hAnsi="Arial" w:cs="Arial"/>
@@ -3447,7 +3447,7 @@
                 <w:delText>Adjustment period / remediation?</w:delText>
               </w:r>
             </w:del>
-            <w:del w:id="1044" w:author="Corsair review" w:date="2026-10-29T18:24:09Z">
+            <w:del w:id="1044" w:author="Corsair review" w:date="2026-10-29T18:28:47Z">
               <w:r>
                 <w:rPr>
                   <w:rFonts w:ascii="Arial" w:hAnsi="Arial" w:cs="Arial"/>
@@ -3457,7 +3457,7 @@
                 <w:delText xml:space="preserve"> </w:delText>
               </w:r>
             </w:del>
-            <w:ins w:id="1045" w:author="Corsair review" w:date="2026-10-29T18:24:09Z">
+            <w:ins w:id="1045" w:author="Corsair review" w:date="2026-10-29T18:28:47Z">
               <w:r>
                 <w:rPr>
                   <w:rFonts w:ascii="Arial" w:hAnsi="Arial" w:cs="Arial"/>
@@ -3481,13 +3481,13 @@
               <w:spacing w:before="120" w:after="288" w:line="276" w:lineRule="auto"/>
               <w:contextualSpacing/>
               <w:rPr>
-                <w:ins w:id="1046" w:author="Corsair review" w:date="2026-10-29T18:24:09Z"/>
+                <w:ins w:id="1046" w:author="Corsair review" w:date="2026-10-29T18:28:47Z"/>
                 <w:rFonts w:ascii="Arial" w:hAnsi="Arial" w:cs="Arial"/>
                 <w:sz w:val="22"/>
                 <w:szCs w:val="22"/>
               </w:rPr>
             </w:pPr>
-            <w:ins w:id="1047" w:author="Corsair review" w:date="2026-10-29T18:24:09Z">
+            <w:ins w:id="1047" w:author="Corsair review" w:date="2026-10-29T18:28:47Z">
               <w:r>
                 <w:rPr>
                   <w:rFonts w:ascii="Arial" w:hAnsi="Arial" w:cs="Arial"/>
@@ -3948,7 +3948,7 @@
         </w:rPr>
         <w:t xml:space="preserve">EFINITY INSURANCE GROUP SPÓŁKA </w:t>
       </w:r>
-      <w:del w:id="1003" w:author="Corsair review" w:date="2026-10-29T18:24:09Z">
+      <w:del w:id="1003" w:author="Corsair review" w:date="2026-10-29T18:28:47Z">
         <w:r>
           <w:rPr>
             <w:rFonts w:ascii="Arial" w:hAnsi="Arial" w:cs="Arial"/>
@@ -3958,7 +3958,7 @@
           <w:delText xml:space="preserve">ACKYJNA</w:delText>
         </w:r>
       </w:del>
-      <w:ins w:id="1004" w:author="Corsair review" w:date="2026-10-29T18:24:09Z">
+      <w:ins w:id="1004" w:author="Corsair review" w:date="2026-10-29T18:28:47Z">
         <w:r>
           <w:rPr>
             <w:rFonts w:ascii="Arial" w:hAnsi="Arial" w:cs="Arial"/>

</xml_diff>